<commit_message>
Add authors: Mateo (@0xCastro) & Juan (@jmgomezl)
- Added Authors section to README.md with GitHub profile links
- Updated design document cover page and authors section

Co-Authored-By: Claude Opus 4.6 (1M context) <noreply@anthropic.com>
</commit_message>
<xml_diff>
--- a/docs/HederaAgentContent_Design_Document.docx
+++ b/docs/HederaAgentContent_Design_Document.docx
@@ -82,7 +82,7 @@
           <w:sz w:val="24"/>
           <w:szCs w:val="24"/>
         </w:rPr>
-        <w:t xml:space="preserve">Author: jmgomezl</w:t>
+        <w:t xml:space="preserve">Authors: Mateo (@0xCastro) &amp; Juan (@jmgomezl)</w:t>
       </w:r>
     </w:p>
     <w:p>
@@ -213,6 +213,7 @@
           <w:ilvl w:val="0"/>
           <w:numId w:val="2"/>
         </w:numPr>
+        <w:spacing w:after="60"/>
       </w:pPr>
       <w:r>
         <w:rPr>
@@ -231,6 +232,7 @@
           <w:ilvl w:val="0"/>
           <w:numId w:val="2"/>
         </w:numPr>
+        <w:spacing w:after="60"/>
       </w:pPr>
       <w:r>
         <w:rPr>
@@ -249,6 +251,7 @@
           <w:ilvl w:val="0"/>
           <w:numId w:val="2"/>
         </w:numPr>
+        <w:spacing w:after="60"/>
       </w:pPr>
       <w:r>
         <w:rPr>
@@ -267,6 +270,7 @@
           <w:ilvl w:val="0"/>
           <w:numId w:val="2"/>
         </w:numPr>
+        <w:spacing w:after="60"/>
       </w:pPr>
       <w:r>
         <w:rPr>
@@ -285,6 +289,7 @@
           <w:ilvl w:val="0"/>
           <w:numId w:val="2"/>
         </w:numPr>
+        <w:spacing w:after="60"/>
       </w:pPr>
       <w:r>
         <w:rPr>
@@ -303,6 +308,7 @@
           <w:ilvl w:val="0"/>
           <w:numId w:val="2"/>
         </w:numPr>
+        <w:spacing w:after="60"/>
       </w:pPr>
       <w:r>
         <w:rPr>
@@ -1262,7 +1268,7 @@
                 <w:sz w:val="20"/>
                 <w:szCs w:val="20"/>
               </w:rPr>
-              <w:t xml:space="preserve">Search the official Hedera YouTube channel for recent videos, fetch transcripts, and extract key technical details and announcements</w:t>
+              <w:t xml:space="preserve">Search the official Hedera YouTube channel for recent videos, fetch transcripts, and extract key technical details</w:t>
             </w:r>
           </w:p>
         </w:tc>
@@ -1716,7 +1722,7 @@
                 <w:sz w:val="20"/>
                 <w:szCs w:val="20"/>
               </w:rPr>
-              <w:t xml:space="preserve">Monitor @Hedera and #Hedera #HBAR hashtags to identify trending topics, announcements, partnerships, and community sentiment</w:t>
+              <w:t xml:space="preserve">Monitor @Hedera and #Hedera #HBAR hashtags to identify trending topics, announcements, partnerships</w:t>
             </w:r>
           </w:p>
         </w:tc>
@@ -2624,7 +2630,7 @@
                 <w:sz w:val="20"/>
                 <w:szCs w:val="20"/>
               </w:rPr>
-              <w:t xml:space="preserve">Analyze aggregated research to identify the best topic and produce a content plan with topic, angle, key points, and source references</w:t>
+              <w:t xml:space="preserve">Analyze aggregated research to identify the best topic and produce a content plan with topic, angle, key points, sources</w:t>
             </w:r>
           </w:p>
         </w:tc>
@@ -2685,6 +2691,66 @@
                 <w:szCs w:val="20"/>
               </w:rPr>
               <w:t xml:space="preserve">None (reasoning only)</w:t>
+            </w:r>
+          </w:p>
+        </w:tc>
+      </w:tr>
+      <w:tr>
+        <w:tc>
+          <w:tcPr>
+            <w:tcW w:type="dxa" w:w="2400"/>
+            <w:tcBorders>
+              <w:top w:val="single" w:color="CCCCCC" w:sz="1"/>
+              <w:left w:val="single" w:color="CCCCCC" w:sz="1"/>
+              <w:bottom w:val="single" w:color="CCCCCC" w:sz="1"/>
+              <w:right w:val="single" w:color="CCCCCC" w:sz="1"/>
+            </w:tcBorders>
+            <w:shd w:fill="FFFFFF" w:val="clear"/>
+            <w:tcMar>
+              <w:top w:type="dxa" w:w="60"/>
+              <w:left w:type="dxa" w:w="100"/>
+              <w:bottom w:type="dxa" w:w="60"/>
+              <w:right w:type="dxa" w:w="100"/>
+            </w:tcMar>
+          </w:tcPr>
+          <w:p>
+            <w:r>
+              <w:rPr>
+                <w:rFonts w:ascii="Arial" w:cs="Arial" w:eastAsia="Arial" w:hAnsi="Arial"/>
+                <w:color w:val="333333"/>
+                <w:sz w:val="20"/>
+                <w:szCs w:val="20"/>
+              </w:rPr>
+              <w:t xml:space="preserve">Max Iterations</w:t>
+            </w:r>
+          </w:p>
+        </w:tc>
+        <w:tc>
+          <w:tcPr>
+            <w:tcW w:type="dxa" w:w="6960"/>
+            <w:tcBorders>
+              <w:top w:val="single" w:color="CCCCCC" w:sz="1"/>
+              <w:left w:val="single" w:color="CCCCCC" w:sz="1"/>
+              <w:bottom w:val="single" w:color="CCCCCC" w:sz="1"/>
+              <w:right w:val="single" w:color="CCCCCC" w:sz="1"/>
+            </w:tcBorders>
+            <w:shd w:fill="FFFFFF" w:val="clear"/>
+            <w:tcMar>
+              <w:top w:type="dxa" w:w="60"/>
+              <w:left w:type="dxa" w:w="100"/>
+              <w:bottom w:type="dxa" w:w="60"/>
+              <w:right w:type="dxa" w:w="100"/>
+            </w:tcMar>
+          </w:tcPr>
+          <w:p>
+            <w:r>
+              <w:rPr>
+                <w:rFonts w:ascii="Arial" w:cs="Arial" w:eastAsia="Arial" w:hAnsi="Arial"/>
+                <w:color w:val="333333"/>
+                <w:sz w:val="20"/>
+                <w:szCs w:val="20"/>
+              </w:rPr>
+              <w:t xml:space="preserve">Default</w:t>
             </w:r>
           </w:p>
         </w:tc>
@@ -3018,7 +3084,7 @@
                 <w:sz w:val="20"/>
                 <w:szCs w:val="20"/>
               </w:rPr>
-              <w:t xml:space="preserve">Transform a content plan into polished, platform-specific content for X/Twitter, Medium, and Discord in the specified language (English or Spanish)</w:t>
+              <w:t xml:space="preserve">Transform content plan into polished platform-specific content in English or Spanish</w:t>
             </w:r>
           </w:p>
         </w:tc>
@@ -3109,7 +3175,7 @@
                 <w:sz w:val="20"/>
                 <w:szCs w:val="20"/>
               </w:rPr>
-              <w:t xml:space="preserve">Allow Delegation</w:t>
+              <w:t xml:space="preserve">Max Iterations</w:t>
             </w:r>
           </w:p>
         </w:tc>
@@ -3138,7 +3204,7 @@
                 <w:sz w:val="20"/>
                 <w:szCs w:val="20"/>
               </w:rPr>
-              <w:t xml:space="preserve">False</w:t>
+              <w:t xml:space="preserve">Default</w:t>
             </w:r>
           </w:p>
         </w:tc>
@@ -3169,7 +3235,7 @@
                 <w:sz w:val="20"/>
                 <w:szCs w:val="20"/>
               </w:rPr>
-              <w:t xml:space="preserve">Bilingual</w:t>
+              <w:t xml:space="preserve">Allow Delegation</w:t>
             </w:r>
           </w:p>
         </w:tc>
@@ -3198,7 +3264,7 @@
                 <w:sz w:val="20"/>
                 <w:szCs w:val="20"/>
               </w:rPr>
-              <w:t xml:space="preserve">Fully fluent in English and Spanish with culturally-aware idiomatic phrasing</w:t>
+              <w:t xml:space="preserve">False</w:t>
             </w:r>
           </w:p>
         </w:tc>
@@ -3718,6 +3784,11 @@
         </w:tc>
       </w:tr>
     </w:tbl>
+    <w:p>
+      <w:pPr>
+        <w:spacing w:after="200"/>
+      </w:pPr>
+    </w:p>
     <w:p>
       <w:r>
         <w:br w:type="page"/>
@@ -4450,7 +4521,7 @@
                 <w:sz w:val="20"/>
                 <w:szCs w:val="20"/>
               </w:rPr>
-              <w:t xml:space="preserve">title, body (Markdown), tags, publish_status</w:t>
+              <w:t xml:space="preserve">title, body (MD), tags, publish_status</w:t>
             </w:r>
           </w:p>
         </w:tc>
@@ -4745,7 +4816,7 @@
           <w:sz w:val="22"/>
           <w:szCs w:val="22"/>
         </w:rPr>
-        <w:t xml:space="preserve">Every tool follows the same error handling pattern: (1) Check for required environment variables, returning a JSON error if missing. (2) Make the API request inside a try/except block catching requests.RequestException. (3) Return a JSON object with an 'error' key on failure, or a success payload on success. This ensures agents always receive parseable JSON responses.</w:t>
+        <w:t xml:space="preserve">Every tool follows the same pattern: (1) Check for required environment variables, returning a JSON error if missing. (2) Make the API request inside a try/except block catching requests.RequestException. (3) Return a JSON object with an 'error' key on failure, or a success payload on success.</w:t>
       </w:r>
     </w:p>
     <w:p>
@@ -4772,7 +4843,7 @@
           <w:sz w:val="22"/>
           <w:szCs w:val="22"/>
         </w:rPr>
-        <w:t xml:space="preserve">All data structures are defined as Pydantic v2 BaseModel classes in src/models.py. They provide type validation, default values, and Field descriptions that give LLMs context about expected output format.</w:t>
+        <w:t xml:space="preserve">All data structures are defined as Pydantic v2 BaseModel classes in src/models.py with Field descriptions that give LLMs context about expected output format.</w:t>
       </w:r>
     </w:p>
     <w:p>
@@ -5222,7 +5293,7 @@
                 <w:sz w:val="20"/>
                 <w:szCs w:val="20"/>
               </w:rPr>
-              <w:t xml:space="preserve">youtube_videos[], youtube_transcripts[], tweets[], web_articles[], key_topics[], summary</w:t>
+              <w:t xml:space="preserve">youtube_videos[], tweets[], web_articles[], key_topics[], summary</w:t>
             </w:r>
           </w:p>
         </w:tc>
@@ -5251,7 +5322,7 @@
                 <w:sz w:val="20"/>
                 <w:szCs w:val="20"/>
               </w:rPr>
-              <w:t xml:space="preserve">Aggregated research from all sources</w:t>
+              <w:t xml:space="preserve">Aggregated research</w:t>
             </w:r>
           </w:p>
         </w:tc>
@@ -5437,7 +5508,7 @@
                 <w:sz w:val="20"/>
                 <w:szCs w:val="20"/>
               </w:rPr>
-              <w:t xml:space="preserve">topic, angle, key_points[], target_audience, sources[], content_types[], language</w:t>
+              <w:t xml:space="preserve">topic, angle, key_points[], sources[], content_types[], language</w:t>
             </w:r>
           </w:p>
         </w:tc>
@@ -5466,7 +5537,7 @@
                 <w:sz w:val="20"/>
                 <w:szCs w:val="20"/>
               </w:rPr>
-              <w:t xml:space="preserve">Strategic plan for content creation</w:t>
+              <w:t xml:space="preserve">Strategic plan</w:t>
             </w:r>
           </w:p>
         </w:tc>
@@ -5526,7 +5597,7 @@
                 <w:sz w:val="20"/>
                 <w:szCs w:val="20"/>
               </w:rPr>
-              <w:t xml:space="preserve">tweets[] (max 280 chars each), hashtags[], language</w:t>
+              <w:t xml:space="preserve">tweets[] (max 280 chars), hashtags[], language</w:t>
             </w:r>
           </w:p>
         </w:tc>
@@ -5555,7 +5626,7 @@
                 <w:sz w:val="20"/>
                 <w:szCs w:val="20"/>
               </w:rPr>
-              <w:t xml:space="preserve">Ready-to-publish tweet thread</w:t>
+              <w:t xml:space="preserve">Tweet thread</w:t>
             </w:r>
           </w:p>
         </w:tc>
@@ -5644,7 +5715,7 @@
                 <w:sz w:val="20"/>
                 <w:szCs w:val="20"/>
               </w:rPr>
-              <w:t xml:space="preserve">Ready-to-publish Medium article</w:t>
+              <w:t xml:space="preserve">Medium article</w:t>
             </w:r>
           </w:p>
         </w:tc>
@@ -5704,7 +5775,7 @@
                 <w:sz w:val="20"/>
                 <w:szCs w:val="20"/>
               </w:rPr>
-              <w:t xml:space="preserve">title, description (max 4096 chars), url, color (0x8259EF), fields[]</w:t>
+              <w:t xml:space="preserve">title, description (max 4096 chars), url, color, fields[]</w:t>
             </w:r>
           </w:p>
         </w:tc>
@@ -5733,7 +5804,7 @@
                 <w:sz w:val="20"/>
                 <w:szCs w:val="20"/>
               </w:rPr>
-              <w:t xml:space="preserve">Ready-to-publish Discord embed</w:t>
+              <w:t xml:space="preserve">Discord embed</w:t>
             </w:r>
           </w:p>
         </w:tc>
@@ -5919,7 +5990,7 @@
                 <w:sz w:val="20"/>
                 <w:szCs w:val="20"/>
               </w:rPr>
-              <w:t xml:space="preserve">platform (twitter|medium|discord), success, url, error</w:t>
+              <w:t xml:space="preserve">platform, success, url, error</w:t>
             </w:r>
           </w:p>
         </w:tc>
@@ -5948,7 +6019,7 @@
                 <w:sz w:val="20"/>
                 <w:szCs w:val="20"/>
               </w:rPr>
-              <w:t xml:space="preserve">Result from a single platform</w:t>
+              <w:t xml:space="preserve">Single platform result</w:t>
             </w:r>
           </w:p>
         </w:tc>
@@ -6037,7 +6108,7 @@
                 <w:sz w:val="20"/>
                 <w:szCs w:val="20"/>
               </w:rPr>
-              <w:t xml:space="preserve">Aggregated results across all platforms</w:t>
+              <w:t xml:space="preserve">Aggregated results</w:t>
             </w:r>
           </w:p>
         </w:tc>
@@ -6067,7 +6138,7 @@
           <w:sz w:val="22"/>
           <w:szCs w:val="22"/>
         </w:rPr>
-        <w:t xml:space="preserve">The system uses CrewAI 1.12+ with the @CrewBase decorator pattern. Each crew is a Python class decorated with @CrewBase that defines agents (via @agent), tasks (via @task), and assembles them into a crew (via @crew). Configuration is loaded from per-crew YAML files.</w:t>
+        <w:t xml:space="preserve">The system uses CrewAI 1.12+ with the @CrewBase decorator pattern. Each crew is a Python class that defines agents, tasks, and assembles them. Configuration is split into per-crew YAML files to avoid cross-crew agent resolution conflicts.</w:t>
       </w:r>
     </w:p>
     <w:p>
@@ -6081,20 +6152,6 @@
       </w:pPr>
       <w:r>
         <w:t xml:space="preserve">YAML Configuration Split</w:t>
-      </w:r>
-    </w:p>
-    <w:p>
-      <w:pPr>
-        <w:spacing w:after="120"/>
-      </w:pPr>
-      <w:r>
-        <w:rPr>
-          <w:rFonts w:ascii="Arial" w:cs="Arial" w:eastAsia="Arial" w:hAnsi="Arial"/>
-          <w:color w:val="333333"/>
-          <w:sz w:val="22"/>
-          <w:szCs w:val="22"/>
-        </w:rPr>
-        <w:t xml:space="preserve">CrewAI 1.x loads all tasks from a YAML file and attempts to resolve agent references. To avoid cross-crew conflicts, the configuration is split into per-crew files:</w:t>
       </w:r>
     </w:p>
     <w:tbl>
@@ -6490,20 +6547,6 @@
         <w:t xml:space="preserve">LLM Configuration</w:t>
       </w:r>
     </w:p>
-    <w:p>
-      <w:pPr>
-        <w:spacing w:after="120"/>
-      </w:pPr>
-      <w:r>
-        <w:rPr>
-          <w:rFonts w:ascii="Arial" w:cs="Arial" w:eastAsia="Arial" w:hAnsi="Arial"/>
-          <w:color w:val="333333"/>
-          <w:sz w:val="22"/>
-          <w:szCs w:val="22"/>
-        </w:rPr>
-        <w:t xml:space="preserve">All agents share a common LLM instance created by the _llm() factory function. It uses CrewAI's native LLM class (not LangChain's ChatOpenAI, which is incompatible with CrewAI 1.x agent validation).</w:t>
-      </w:r>
-    </w:p>
     <w:tbl>
       <w:tblPr>
         <w:tblW w:type="dxa" w:w="9360"/>
@@ -6885,16 +6928,16 @@
       </w:tr>
     </w:tbl>
     <w:p>
-      <w:pPr>
-        <w:spacing w:after="200"/>
-      </w:pPr>
-    </w:p>
-    <w:p>
-      <w:pPr>
-        <w:pStyle w:val="Heading2"/>
-      </w:pPr>
       <w:r>
-        <w:t xml:space="preserve">Process Flow</w:t>
+        <w:br w:type="page"/>
+      </w:r>
+    </w:p>
+    <w:p>
+      <w:pPr>
+        <w:pStyle w:val="Heading1"/>
+      </w:pPr>
+      <w:r>
+        <w:t xml:space="preserve">7. Language Support</w:t>
       </w:r>
     </w:p>
     <w:p>
@@ -6908,34 +6951,7 @@
           <w:sz w:val="22"/>
           <w:szCs w:val="22"/>
         </w:rPr>
-        <w:t xml:space="preserve">All three crews use Process.sequential, meaning tasks execute one after another in the order defined. Each task's output is available as context to subsequent tasks. The crews are invoked sequentially from main.py via the .kickoff(inputs={...}) method.</w:t>
-      </w:r>
-    </w:p>
-    <w:p>
-      <w:r>
-        <w:br w:type="page"/>
-      </w:r>
-    </w:p>
-    <w:p>
-      <w:pPr>
-        <w:pStyle w:val="Heading1"/>
-      </w:pPr>
-      <w:r>
-        <w:t xml:space="preserve">7. Language Support</w:t>
-      </w:r>
-    </w:p>
-    <w:p>
-      <w:pPr>
-        <w:spacing w:after="120"/>
-      </w:pPr>
-      <w:r>
-        <w:rPr>
-          <w:rFonts w:ascii="Arial" w:cs="Arial" w:eastAsia="Arial" w:hAnsi="Arial"/>
-          <w:color w:val="333333"/>
-          <w:sz w:val="22"/>
-          <w:szCs w:val="22"/>
-        </w:rPr>
-        <w:t xml:space="preserve">The system supports bilingual content generation in English and Spanish. The language is selected via the --language CLI flag (en or es) and propagated through the entire writing pipeline.</w:t>
+        <w:t xml:space="preserve">The system supports bilingual content generation in English and Spanish, selected via the --language CLI flag and propagated through the entire writing pipeline.</w:t>
       </w:r>
     </w:p>
     <w:p>
@@ -7005,7 +7021,7 @@
           <w:sz w:val="22"/>
           <w:szCs w:val="22"/>
         </w:rPr>
-        <w:t xml:space="preserve">Writing Tasks YAML: Task descriptions use {language_name} and {language} template variables, e.g., 'Write ALL content in {language_name}'</w:t>
+        <w:t xml:space="preserve">Writing Tasks YAML: Task descriptions use {language_name} and {language} template variables</w:t>
       </w:r>
     </w:p>
     <w:p>
@@ -7024,7 +7040,7 @@
           <w:sz w:val="22"/>
           <w:szCs w:val="22"/>
         </w:rPr>
-        <w:t xml:space="preserve">Writer Agent: Backstory declares bilingual fluency in English and Spanish with culturally-aware idiomatic phrasing</w:t>
+        <w:t xml:space="preserve">Writer Agent: Backstory declares bilingual fluency with culturally-aware idiomatic phrasing</w:t>
       </w:r>
     </w:p>
     <w:p>
@@ -7043,7 +7059,7 @@
           <w:sz w:val="22"/>
           <w:szCs w:val="22"/>
         </w:rPr>
-        <w:t xml:space="preserve">Prompt Templates: LANGUAGE_INSTRUCTIONS dict maps language codes to full writing instructions in the target language</w:t>
+        <w:t xml:space="preserve">Prompt Templates: LANGUAGE_INSTRUCTIONS dict maps codes to full writing instructions in target language</w:t>
       </w:r>
     </w:p>
     <w:p>
@@ -7062,7 +7078,7 @@
           <w:sz w:val="22"/>
           <w:szCs w:val="22"/>
         </w:rPr>
-        <w:t xml:space="preserve">Output Models: ContentPlan, TwitterContent, and MediumArticle include a 'language' field (default: 'en')</w:t>
+        <w:t xml:space="preserve">Output Models: ContentPlan, TwitterContent, MediumArticle include a 'language' field</w:t>
       </w:r>
     </w:p>
     <w:p>
@@ -7081,20 +7097,20 @@
           <w:sz w:val="22"/>
           <w:szCs w:val="22"/>
         </w:rPr>
-        <w:t xml:space="preserve">Research Phase: Always runs in English regardless of target language (source data is English)</w:t>
+        <w:t xml:space="preserve">Research Phase: Always runs in English regardless of target language</w:t>
       </w:r>
     </w:p>
     <w:p>
-      <w:pPr>
-        <w:spacing w:after="200"/>
-      </w:pPr>
-    </w:p>
-    <w:p>
-      <w:pPr>
-        <w:pStyle w:val="Heading2"/>
-      </w:pPr>
       <w:r>
-        <w:t xml:space="preserve">Adding a New Language</w:t>
+        <w:br w:type="page"/>
+      </w:r>
+    </w:p>
+    <w:p>
+      <w:pPr>
+        <w:pStyle w:val="Heading1"/>
+      </w:pPr>
+      <w:r>
+        <w:t xml:space="preserve">8. Prompt Engineering</w:t>
       </w:r>
     </w:p>
     <w:p>
@@ -7108,25 +7124,30 @@
           <w:sz w:val="22"/>
           <w:szCs w:val="22"/>
         </w:rPr>
-        <w:t xml:space="preserve">To add a new language (e.g., Portuguese): (1) Add the language code and instruction to LANGUAGE_INSTRUCTIONS in src/prompts/templates.py. (2) Add the choice to the --language argument in main.py. (3) Update the writer agent backstory in src/config/writing_agents.yaml to include the new language.</w:t>
+        <w:t xml:space="preserve">The system uses 5 prompt templates in src/prompts/templates.py with strict anti-hallucination rules and platform-specific formatting.</w:t>
       </w:r>
     </w:p>
     <w:p>
+      <w:pPr>
+        <w:spacing w:after="200"/>
+      </w:pPr>
+    </w:p>
+    <w:p>
+      <w:pPr>
+        <w:pStyle w:val="Heading2"/>
+      </w:pPr>
       <w:r>
-        <w:br w:type="page"/>
+        <w:t xml:space="preserve">Design Principles</w:t>
       </w:r>
     </w:p>
     <w:p>
       <w:pPr>
-        <w:pStyle w:val="Heading1"/>
-      </w:pPr>
-      <w:r>
-        <w:t xml:space="preserve">8. Prompt Engineering</w:t>
-      </w:r>
-    </w:p>
-    <w:p>
-      <w:pPr>
-        <w:spacing w:after="120"/>
+        <w:pStyle w:val="ListParagraph"/>
+        <w:numPr>
+          <w:ilvl w:val="0"/>
+          <w:numId w:val="2"/>
+        </w:numPr>
+        <w:spacing w:after="60"/>
       </w:pPr>
       <w:r>
         <w:rPr>
@@ -7135,20 +7156,7 @@
           <w:sz w:val="22"/>
           <w:szCs w:val="22"/>
         </w:rPr>
-        <w:t xml:space="preserve">The system uses 5 prompt templates defined in src/prompts/templates.py. All prompts follow strict design principles to ensure factual accuracy and platform-appropriate formatting.</w:t>
-      </w:r>
-    </w:p>
-    <w:p>
-      <w:pPr>
-        <w:spacing w:after="200"/>
-      </w:pPr>
-    </w:p>
-    <w:p>
-      <w:pPr>
-        <w:pStyle w:val="Heading2"/>
-      </w:pPr>
-      <w:r>
-        <w:t xml:space="preserve">Design Principles</w:t>
+        <w:t xml:space="preserve">Anti-hallucination: Every writing prompt includes 'Do NOT invent facts not present in the content plan'</w:t>
       </w:r>
     </w:p>
     <w:p>
@@ -7167,7 +7175,7 @@
           <w:sz w:val="22"/>
           <w:szCs w:val="22"/>
         </w:rPr>
-        <w:t xml:space="preserve">Anti-hallucination: Every writing prompt includes 'Do NOT invent facts, metrics, or links not present in the content plan'</w:t>
+        <w:t xml:space="preserve">Structured output: All writing prompts request JSON output matching Pydantic models</w:t>
       </w:r>
     </w:p>
     <w:p>
@@ -7186,26 +7194,7 @@
           <w:sz w:val="22"/>
           <w:szCs w:val="22"/>
         </w:rPr>
-        <w:t xml:space="preserve">Structured output: All writing prompts request JSON output with specific field names matching Pydantic models</w:t>
-      </w:r>
-    </w:p>
-    <w:p>
-      <w:pPr>
-        <w:pStyle w:val="ListParagraph"/>
-        <w:numPr>
-          <w:ilvl w:val="0"/>
-          <w:numId w:val="2"/>
-        </w:numPr>
-        <w:spacing w:after="60"/>
-      </w:pPr>
-      <w:r>
-        <w:rPr>
-          <w:rFonts w:ascii="Arial" w:cs="Arial" w:eastAsia="Arial" w:hAnsi="Arial"/>
-          <w:color w:val="333333"/>
-          <w:sz w:val="22"/>
-          <w:szCs w:val="22"/>
-        </w:rPr>
-        <w:t xml:space="preserve">Platform-specific: Each platform prompt includes formatting rules (Twitter: 280 char limit, Medium: Markdown with H2 sections, Discord: embed format under 4096 chars)</w:t>
+        <w:t xml:space="preserve">Platform-specific: Twitter (280 chars), Medium (Markdown, H2 sections), Discord (embed, 4096 chars)</w:t>
       </w:r>
     </w:p>
     <w:p>
@@ -7455,7 +7444,7 @@
                 <w:sz w:val="20"/>
                 <w:szCs w:val="20"/>
               </w:rPr>
-              <w:t xml:space="preserve">Synthesize YouTube, Twitter, and web research into key topics and recommended topic</w:t>
+              <w:t xml:space="preserve">Synthesize research into key topics and recommended topic</w:t>
             </w:r>
           </w:p>
         </w:tc>
@@ -7544,7 +7533,7 @@
                 <w:sz w:val="20"/>
                 <w:szCs w:val="20"/>
               </w:rPr>
-              <w:t xml:space="preserve">Create a content plan with topic, angle, key points, and sources</w:t>
+              <w:t xml:space="preserve">Create plan with topic, angle, key points, sources</w:t>
             </w:r>
           </w:p>
         </w:tc>
@@ -7633,7 +7622,7 @@
                 <w:sz w:val="20"/>
                 <w:szCs w:val="20"/>
               </w:rPr>
-              <w:t xml:space="preserve">Generate a tweet thread (2-5 tweets) with hashtags in the target language</w:t>
+              <w:t xml:space="preserve">Generate tweet thread (2-5 tweets) with hashtags</w:t>
             </w:r>
           </w:p>
         </w:tc>
@@ -7722,7 +7711,7 @@
                 <w:sz w:val="20"/>
                 <w:szCs w:val="20"/>
               </w:rPr>
-              <w:t xml:space="preserve">Write an 800-1500 word Markdown article with TL;DR, H2 sections, and CTA</w:t>
+              <w:t xml:space="preserve">Write 800-1500 word Markdown article with TL;DR and CTA</w:t>
             </w:r>
           </w:p>
         </w:tc>
@@ -7811,7 +7800,7 @@
                 <w:sz w:val="20"/>
                 <w:szCs w:val="20"/>
               </w:rPr>
-              <w:t xml:space="preserve">Create a Discord announcement with title, description, and engagement prompt</w:t>
+              <w:t xml:space="preserve">Create Discord announcement with engagement prompt</w:t>
             </w:r>
           </w:p>
         </w:tc>
@@ -7841,21 +7830,13 @@
           <w:sz w:val="22"/>
           <w:szCs w:val="22"/>
         </w:rPr>
-        <w:t xml:space="preserve">The main entry point is main.py, which provides a command-line interface for running the full pipeline or individual phases. It uses argparse for argument parsing and python-dotenv to load API keys from .env.</w:t>
+        <w:t xml:space="preserve">The main entry point is main.py with argparse for argument parsing and python-dotenv to load API keys.</w:t>
       </w:r>
     </w:p>
     <w:p>
       <w:pPr>
         <w:spacing w:after="200"/>
       </w:pPr>
-    </w:p>
-    <w:p>
-      <w:pPr>
-        <w:pStyle w:val="Heading2"/>
-      </w:pPr>
-      <w:r>
-        <w:t xml:space="preserve">CLI Flags</w:t>
-      </w:r>
     </w:p>
     <w:tbl>
       <w:tblPr>
@@ -8114,7 +8095,7 @@
                 <w:sz w:val="20"/>
                 <w:szCs w:val="20"/>
               </w:rPr>
-              <w:t xml:space="preserve">Research topic to search for across all sources</w:t>
+              <w:t xml:space="preserve">Research topic to search across all sources</w:t>
             </w:r>
           </w:p>
         </w:tc>
@@ -8350,7 +8331,7 @@
                 <w:sz w:val="20"/>
                 <w:szCs w:val="20"/>
               </w:rPr>
-              <w:t xml:space="preserve">Run only the research phase, skip writing and publishing</w:t>
+              <w:t xml:space="preserve">Run only research phase</w:t>
             </w:r>
           </w:p>
         </w:tc>
@@ -8468,7 +8449,7 @@
                 <w:sz w:val="20"/>
                 <w:szCs w:val="20"/>
               </w:rPr>
-              <w:t xml:space="preserve">Run research and writing, skip actual publishing to platforms</w:t>
+              <w:t xml:space="preserve">Run research + writing, skip publishing</w:t>
             </w:r>
           </w:p>
         </w:tc>
@@ -8586,23 +8567,23 @@
                 <w:sz w:val="20"/>
                 <w:szCs w:val="20"/>
               </w:rPr>
-              <w:t xml:space="preserve">Disable verbose agent output for cleaner console logs</w:t>
+              <w:t xml:space="preserve">Disable verbose agent output</w:t>
             </w:r>
           </w:p>
         </w:tc>
       </w:tr>
     </w:tbl>
     <w:p>
-      <w:pPr>
-        <w:spacing w:after="200"/>
-      </w:pPr>
-    </w:p>
-    <w:p>
-      <w:pPr>
-        <w:pStyle w:val="Heading2"/>
-      </w:pPr>
       <w:r>
-        <w:t xml:space="preserve">Execution Phases</w:t>
+        <w:br w:type="page"/>
+      </w:r>
+    </w:p>
+    <w:p>
+      <w:pPr>
+        <w:pStyle w:val="Heading1"/>
+      </w:pPr>
+      <w:r>
+        <w:t xml:space="preserve">10. Testing Strategy</w:t>
       </w:r>
     </w:p>
     <w:p>
@@ -8616,62 +8597,7 @@
           <w:sz w:val="22"/>
           <w:szCs w:val="22"/>
         </w:rPr>
-        <w:t xml:space="preserve">Phase 1 (Research): Always runs. Invokes ResearchCrew with {topic} as input. If --research-only is set, the pipeline stops here.</w:t>
-      </w:r>
-    </w:p>
-    <w:p>
-      <w:pPr>
-        <w:spacing w:after="120"/>
-      </w:pPr>
-      <w:r>
-        <w:rPr>
-          <w:rFonts w:ascii="Arial" w:cs="Arial" w:eastAsia="Arial" w:hAnsi="Arial"/>
-          <w:color w:val="333333"/>
-          <w:sz w:val="22"/>
-          <w:szCs w:val="22"/>
-        </w:rPr>
-        <w:t xml:space="preserve">Phase 2 (Writing): Invokes WritingCrew with the research result, language code, and language name as inputs. If --dry-run is set, the pipeline stops here and prints the generated content.</w:t>
-      </w:r>
-    </w:p>
-    <w:p>
-      <w:pPr>
-        <w:spacing w:after="120"/>
-      </w:pPr>
-      <w:r>
-        <w:rPr>
-          <w:rFonts w:ascii="Arial" w:cs="Arial" w:eastAsia="Arial" w:hAnsi="Arial"/>
-          <w:color w:val="333333"/>
-          <w:sz w:val="22"/>
-          <w:szCs w:val="22"/>
-        </w:rPr>
-        <w:t xml:space="preserve">Phase 3 (Publishing): Invokes PublishingCrew with the finalized content. Posts to all three platforms and prints the results.</w:t>
-      </w:r>
-    </w:p>
-    <w:p>
-      <w:r>
-        <w:br w:type="page"/>
-      </w:r>
-    </w:p>
-    <w:p>
-      <w:pPr>
-        <w:pStyle w:val="Heading1"/>
-      </w:pPr>
-      <w:r>
-        <w:t xml:space="preserve">10. Testing Strategy</w:t>
-      </w:r>
-    </w:p>
-    <w:p>
-      <w:pPr>
-        <w:spacing w:after="120"/>
-      </w:pPr>
-      <w:r>
-        <w:rPr>
-          <w:rFonts w:ascii="Arial" w:cs="Arial" w:eastAsia="Arial" w:hAnsi="Arial"/>
-          <w:color w:val="333333"/>
-          <w:sz w:val="22"/>
-          <w:szCs w:val="22"/>
-        </w:rPr>
-        <w:t xml:space="preserve">The test suite contains 44 tests across 3 files, all runnable without API keys using mocked responses. Tests use pytest with pytest-mock for patching.</w:t>
+        <w:t xml:space="preserve">The test suite contains 44 tests across 3 files, all runnable without API keys using mocked responses.</w:t>
       </w:r>
     </w:p>
     <w:p>
@@ -8875,7 +8801,7 @@
                 <w:sz w:val="20"/>
                 <w:szCs w:val="20"/>
               </w:rPr>
-              <w:t xml:space="preserve">All 11 Pydantic models including language field defaults, Spanish content creation, and field validation</w:t>
+              <w:t xml:space="preserve">All 11 Pydantic models including language defaults and Spanish content</w:t>
             </w:r>
           </w:p>
         </w:tc>
@@ -8964,7 +8890,7 @@
                 <w:sz w:val="20"/>
                 <w:szCs w:val="20"/>
               </w:rPr>
-              <w:t xml:space="preserve">All 7 tools with mocked HTTP/API responses, error handling for missing API keys, URL parsing edge cases</w:t>
+              <w:t xml:space="preserve">All 7 tools with mocked HTTP/API responses and error handling</w:t>
             </w:r>
           </w:p>
         </w:tc>
@@ -9053,7 +8979,7 @@
                 <w:sz w:val="20"/>
                 <w:szCs w:val="20"/>
               </w:rPr>
-              <w:t xml:space="preserve">All 3 crews: agent instantiation, task creation, sequential process configuration, tool assignment counts</w:t>
+              <w:t xml:space="preserve">All 3 crews: agent instantiation, task creation, process configuration</w:t>
             </w:r>
           </w:p>
         </w:tc>
@@ -9088,7 +9014,7 @@
           <w:sz w:val="22"/>
           <w:szCs w:val="22"/>
         </w:rPr>
-        <w:t xml:space="preserve">API calls: @patch('module.requests.get') or @patch('module.requests.post') with MagicMock responses</w:t>
+        <w:t xml:space="preserve">API calls: @patch with MagicMock responses for requests.get/post</w:t>
       </w:r>
     </w:p>
     <w:p>
@@ -9107,7 +9033,7 @@
           <w:sz w:val="22"/>
           <w:szCs w:val="22"/>
         </w:rPr>
-        <w:t xml:space="preserve">Environment variables: @patch.dict('os.environ', {...}) for setting or clearing API keys</w:t>
+        <w:t xml:space="preserve">Environment variables: @patch.dict('os.environ') for setting/clearing API keys</w:t>
       </w:r>
     </w:p>
     <w:p>
@@ -9126,7 +9052,7 @@
           <w:sz w:val="22"/>
           <w:szCs w:val="22"/>
         </w:rPr>
-        <w:t xml:space="preserve">YouTube transcript API: @patch('src.tools.youtube_tools.YouTubeTranscriptApi') with mock entry objects</w:t>
+        <w:t xml:space="preserve">YouTube transcript API: @patch('...YouTubeTranscriptApi') with mock entry objects</w:t>
       </w:r>
     </w:p>
     <w:p>
@@ -9145,7 +9071,7 @@
           <w:sz w:val="22"/>
           <w:szCs w:val="22"/>
         </w:rPr>
-        <w:t xml:space="preserve">OAuth: @patch('src.tools.twitter_tools._oauth1_session') for Twitter write operations</w:t>
+        <w:t xml:space="preserve">OAuth: @patch('..._oauth1_session') for Twitter write operations</w:t>
       </w:r>
     </w:p>
     <w:p>
@@ -9164,7 +9090,7 @@
           <w:sz w:val="22"/>
           <w:szCs w:val="22"/>
         </w:rPr>
-        <w:t xml:space="preserve">Shared fixtures: conftest.py provides sample_youtube_response, sample_twitter_response, sample_medium_response, sample_content_plan, sample_tweet_content</w:t>
+        <w:t xml:space="preserve">Shared fixtures: conftest.py provides 5 sample response fixtures</w:t>
       </w:r>
     </w:p>
     <w:p>
@@ -9191,7 +9117,7 @@
           <w:sz w:val="22"/>
           <w:szCs w:val="22"/>
         </w:rPr>
-        <w:t xml:space="preserve">All secrets are stored in a .env file (gitignored) and loaded via python-dotenv. The .env.example template documents every required key.</w:t>
+        <w:t xml:space="preserve">All secrets are stored in .env (gitignored) and loaded via python-dotenv.</w:t>
       </w:r>
     </w:p>
     <w:p>
@@ -9692,7 +9618,7 @@
                 <w:sz w:val="20"/>
                 <w:szCs w:val="20"/>
               </w:rPr>
-              <w:t xml:space="preserve">Console &gt; APIs &gt; YouTube Data API v3 &gt; Credentials</w:t>
+              <w:t xml:space="preserve">Console &gt; APIs &gt; YouTube Data API v3</w:t>
             </w:r>
           </w:p>
         </w:tc>
@@ -10400,7 +10326,7 @@
                 <w:sz w:val="20"/>
                 <w:szCs w:val="20"/>
               </w:rPr>
-              <w:t xml:space="preserve">Bearer token for search (read) operations</w:t>
+              <w:t xml:space="preserve">Bearer token for search operations</w:t>
             </w:r>
           </w:p>
         </w:tc>
@@ -10518,7 +10444,7 @@
                 <w:sz w:val="20"/>
                 <w:szCs w:val="20"/>
               </w:rPr>
-              <w:t xml:space="preserve">medium.com/me/settings/security &gt; Integration tokens</w:t>
+              <w:t xml:space="preserve">medium.com/me/settings/security</w:t>
             </w:r>
           </w:p>
         </w:tc>
@@ -11272,7 +11198,7 @@
                 <w:sz w:val="20"/>
                 <w:szCs w:val="20"/>
               </w:rPr>
-              <w:t xml:space="preserve">Twitter/X Research &amp; Publishing</w:t>
+              <w:t xml:space="preserve">Twitter/X</w:t>
             </w:r>
           </w:p>
         </w:tc>
@@ -12085,7 +12011,7 @@
                 <w:sz w:val="20"/>
                 <w:szCs w:val="20"/>
               </w:rPr>
-              <w:t xml:space="preserve">.env</w:t>
+              <w:t xml:space="preserve">config/</w:t>
             </w:r>
           </w:p>
         </w:tc>
@@ -12114,7 +12040,7 @@
                 <w:sz w:val="20"/>
                 <w:szCs w:val="20"/>
               </w:rPr>
-              <w:t xml:space="preserve">Actual API keys (gitignored, never committed)</w:t>
+              <w:t xml:space="preserve">Reference copies of all agent and task YAML definitions</w:t>
             </w:r>
           </w:p>
         </w:tc>
@@ -12145,7 +12071,7 @@
                 <w:sz w:val="20"/>
                 <w:szCs w:val="20"/>
               </w:rPr>
-              <w:t xml:space="preserve">.gitignore</w:t>
+              <w:t xml:space="preserve">src/crew.py</w:t>
             </w:r>
           </w:p>
         </w:tc>
@@ -12174,7 +12100,7 @@
                 <w:sz w:val="20"/>
                 <w:szCs w:val="20"/>
               </w:rPr>
-              <w:t xml:space="preserve">Excludes .env, .venv, __pycache__, .pytest_cache</w:t>
+              <w:t xml:space="preserve">3 CrewAI crews: ResearchCrew, WritingCrew, PublishingCrew</w:t>
             </w:r>
           </w:p>
         </w:tc>
@@ -12205,7 +12131,7 @@
                 <w:sz w:val="20"/>
                 <w:szCs w:val="20"/>
               </w:rPr>
-              <w:t xml:space="preserve">config/agents.yaml</w:t>
+              <w:t xml:space="preserve">src/models.py</w:t>
             </w:r>
           </w:p>
         </w:tc>
@@ -12234,7 +12160,7 @@
                 <w:sz w:val="20"/>
                 <w:szCs w:val="20"/>
               </w:rPr>
-              <w:t xml:space="preserve">All agent definitions (reference copy)</w:t>
+              <w:t xml:space="preserve">11 Pydantic models for structured I/O</w:t>
             </w:r>
           </w:p>
         </w:tc>
@@ -12265,7 +12191,7 @@
                 <w:sz w:val="20"/>
                 <w:szCs w:val="20"/>
               </w:rPr>
-              <w:t xml:space="preserve">config/tasks.yaml</w:t>
+              <w:t xml:space="preserve">src/config/</w:t>
             </w:r>
           </w:p>
         </w:tc>
@@ -12294,7 +12220,7 @@
                 <w:sz w:val="20"/>
                 <w:szCs w:val="20"/>
               </w:rPr>
-              <w:t xml:space="preserve">All task definitions (reference copy)</w:t>
+              <w:t xml:space="preserve">Per-crew YAML configs (6 files for 3 crews)</w:t>
             </w:r>
           </w:p>
         </w:tc>
@@ -12325,7 +12251,7 @@
                 <w:sz w:val="20"/>
                 <w:szCs w:val="20"/>
               </w:rPr>
-              <w:t xml:space="preserve">src/__init__.py</w:t>
+              <w:t xml:space="preserve">src/tools/</w:t>
             </w:r>
           </w:p>
         </w:tc>
@@ -12354,7 +12280,7 @@
                 <w:sz w:val="20"/>
                 <w:szCs w:val="20"/>
               </w:rPr>
-              <w:t xml:space="preserve">Package init</w:t>
+              <w:t xml:space="preserve">7 tool implementations (YouTube, Twitter, Medium, Discord, Web)</w:t>
             </w:r>
           </w:p>
         </w:tc>
@@ -12385,7 +12311,7 @@
                 <w:sz w:val="20"/>
                 <w:szCs w:val="20"/>
               </w:rPr>
-              <w:t xml:space="preserve">src/crew.py</w:t>
+              <w:t xml:space="preserve">src/prompts/templates.py</w:t>
             </w:r>
           </w:p>
         </w:tc>
@@ -12414,7 +12340,7 @@
                 <w:sz w:val="20"/>
                 <w:szCs w:val="20"/>
               </w:rPr>
-              <w:t xml:space="preserve">3 CrewAI crews: ResearchCrew, WritingCrew, PublishingCrew</w:t>
+              <w:t xml:space="preserve">5 prompt templates with language support</w:t>
             </w:r>
           </w:p>
         </w:tc>
@@ -12445,7 +12371,7 @@
                 <w:sz w:val="20"/>
                 <w:szCs w:val="20"/>
               </w:rPr>
-              <w:t xml:space="preserve">src/models.py</w:t>
+              <w:t xml:space="preserve">tests/conftest.py</w:t>
             </w:r>
           </w:p>
         </w:tc>
@@ -12474,7 +12400,7 @@
                 <w:sz w:val="20"/>
                 <w:szCs w:val="20"/>
               </w:rPr>
-              <w:t xml:space="preserve">11 Pydantic models for structured I/O</w:t>
+              <w:t xml:space="preserve">Shared pytest fixtures (5 sample responses)</w:t>
             </w:r>
           </w:p>
         </w:tc>
@@ -12505,7 +12431,7 @@
                 <w:sz w:val="20"/>
                 <w:szCs w:val="20"/>
               </w:rPr>
-              <w:t xml:space="preserve">src/config/research_agents.yaml</w:t>
+              <w:t xml:space="preserve">tests/test_models.py</w:t>
             </w:r>
           </w:p>
         </w:tc>
@@ -12534,7 +12460,7 @@
                 <w:sz w:val="20"/>
                 <w:szCs w:val="20"/>
               </w:rPr>
-              <w:t xml:space="preserve">4 research agent definitions</w:t>
+              <w:t xml:space="preserve">16 Pydantic model tests including Spanish language</w:t>
             </w:r>
           </w:p>
         </w:tc>
@@ -12565,7 +12491,7 @@
                 <w:sz w:val="20"/>
                 <w:szCs w:val="20"/>
               </w:rPr>
-              <w:t xml:space="preserve">src/config/research_tasks.yaml</w:t>
+              <w:t xml:space="preserve">tests/test_tools.py</w:t>
             </w:r>
           </w:p>
         </w:tc>
@@ -12594,7 +12520,7 @@
                 <w:sz w:val="20"/>
                 <w:szCs w:val="20"/>
               </w:rPr>
-              <w:t xml:space="preserve">4 research task definitions</w:t>
+              <w:t xml:space="preserve">19 tool tests with mocked API calls</w:t>
             </w:r>
           </w:p>
         </w:tc>
@@ -12625,7 +12551,7 @@
                 <w:sz w:val="20"/>
                 <w:szCs w:val="20"/>
               </w:rPr>
-              <w:t xml:space="preserve">src/config/writing_agents.yaml</w:t>
+              <w:t xml:space="preserve">tests/test_crew.py</w:t>
             </w:r>
           </w:p>
         </w:tc>
@@ -12654,7 +12580,7 @@
                 <w:sz w:val="20"/>
                 <w:szCs w:val="20"/>
               </w:rPr>
-              <w:t xml:space="preserve">1 bilingual writer agent definition</w:t>
+              <w:t xml:space="preserve">9 crew integration tests</w:t>
             </w:r>
           </w:p>
         </w:tc>
@@ -12685,7 +12611,7 @@
                 <w:sz w:val="20"/>
                 <w:szCs w:val="20"/>
               </w:rPr>
-              <w:t xml:space="preserve">src/config/writing_tasks.yaml</w:t>
+              <w:t xml:space="preserve">docs/</w:t>
             </w:r>
           </w:p>
         </w:tc>
@@ -12714,907 +12640,7 @@
                 <w:sz w:val="20"/>
                 <w:szCs w:val="20"/>
               </w:rPr>
-              <w:t xml:space="preserve">3 writing tasks with language template variables</w:t>
-            </w:r>
-          </w:p>
-        </w:tc>
-      </w:tr>
-      <w:tr>
-        <w:tc>
-          <w:tcPr>
-            <w:tcW w:type="dxa" w:w="3600"/>
-            <w:tcBorders>
-              <w:top w:val="single" w:color="CCCCCC" w:sz="1"/>
-              <w:left w:val="single" w:color="CCCCCC" w:sz="1"/>
-              <w:bottom w:val="single" w:color="CCCCCC" w:sz="1"/>
-              <w:right w:val="single" w:color="CCCCCC" w:sz="1"/>
-            </w:tcBorders>
-            <w:shd w:fill="FFFFFF" w:val="clear"/>
-            <w:tcMar>
-              <w:top w:type="dxa" w:w="60"/>
-              <w:left w:type="dxa" w:w="100"/>
-              <w:bottom w:type="dxa" w:w="60"/>
-              <w:right w:type="dxa" w:w="100"/>
-            </w:tcMar>
-          </w:tcPr>
-          <w:p>
-            <w:r>
-              <w:rPr>
-                <w:rFonts w:ascii="Arial" w:cs="Arial" w:eastAsia="Arial" w:hAnsi="Arial"/>
-                <w:color w:val="333333"/>
-                <w:sz w:val="20"/>
-                <w:szCs w:val="20"/>
-              </w:rPr>
-              <w:t xml:space="preserve">src/config/publishing_agents.yaml</w:t>
-            </w:r>
-          </w:p>
-        </w:tc>
-        <w:tc>
-          <w:tcPr>
-            <w:tcW w:type="dxa" w:w="5760"/>
-            <w:tcBorders>
-              <w:top w:val="single" w:color="CCCCCC" w:sz="1"/>
-              <w:left w:val="single" w:color="CCCCCC" w:sz="1"/>
-              <w:bottom w:val="single" w:color="CCCCCC" w:sz="1"/>
-              <w:right w:val="single" w:color="CCCCCC" w:sz="1"/>
-            </w:tcBorders>
-            <w:shd w:fill="FFFFFF" w:val="clear"/>
-            <w:tcMar>
-              <w:top w:type="dxa" w:w="60"/>
-              <w:left w:type="dxa" w:w="100"/>
-              <w:bottom w:type="dxa" w:w="60"/>
-              <w:right w:type="dxa" w:w="100"/>
-            </w:tcMar>
-          </w:tcPr>
-          <w:p>
-            <w:r>
-              <w:rPr>
-                <w:rFonts w:ascii="Arial" w:cs="Arial" w:eastAsia="Arial" w:hAnsi="Arial"/>
-                <w:color w:val="333333"/>
-                <w:sz w:val="20"/>
-                <w:szCs w:val="20"/>
-              </w:rPr>
-              <w:t xml:space="preserve">1 publisher agent definition</w:t>
-            </w:r>
-          </w:p>
-        </w:tc>
-      </w:tr>
-      <w:tr>
-        <w:tc>
-          <w:tcPr>
-            <w:tcW w:type="dxa" w:w="3600"/>
-            <w:tcBorders>
-              <w:top w:val="single" w:color="CCCCCC" w:sz="1"/>
-              <w:left w:val="single" w:color="CCCCCC" w:sz="1"/>
-              <w:bottom w:val="single" w:color="CCCCCC" w:sz="1"/>
-              <w:right w:val="single" w:color="CCCCCC" w:sz="1"/>
-            </w:tcBorders>
-            <w:shd w:fill="FFFFFF" w:val="clear"/>
-            <w:tcMar>
-              <w:top w:type="dxa" w:w="60"/>
-              <w:left w:type="dxa" w:w="100"/>
-              <w:bottom w:type="dxa" w:w="60"/>
-              <w:right w:type="dxa" w:w="100"/>
-            </w:tcMar>
-          </w:tcPr>
-          <w:p>
-            <w:r>
-              <w:rPr>
-                <w:rFonts w:ascii="Arial" w:cs="Arial" w:eastAsia="Arial" w:hAnsi="Arial"/>
-                <w:color w:val="333333"/>
-                <w:sz w:val="20"/>
-                <w:szCs w:val="20"/>
-              </w:rPr>
-              <w:t xml:space="preserve">src/config/publishing_tasks.yaml</w:t>
-            </w:r>
-          </w:p>
-        </w:tc>
-        <w:tc>
-          <w:tcPr>
-            <w:tcW w:type="dxa" w:w="5760"/>
-            <w:tcBorders>
-              <w:top w:val="single" w:color="CCCCCC" w:sz="1"/>
-              <w:left w:val="single" w:color="CCCCCC" w:sz="1"/>
-              <w:bottom w:val="single" w:color="CCCCCC" w:sz="1"/>
-              <w:right w:val="single" w:color="CCCCCC" w:sz="1"/>
-            </w:tcBorders>
-            <w:shd w:fill="FFFFFF" w:val="clear"/>
-            <w:tcMar>
-              <w:top w:type="dxa" w:w="60"/>
-              <w:left w:type="dxa" w:w="100"/>
-              <w:bottom w:type="dxa" w:w="60"/>
-              <w:right w:type="dxa" w:w="100"/>
-            </w:tcMar>
-          </w:tcPr>
-          <w:p>
-            <w:r>
-              <w:rPr>
-                <w:rFonts w:ascii="Arial" w:cs="Arial" w:eastAsia="Arial" w:hAnsi="Arial"/>
-                <w:color w:val="333333"/>
-                <w:sz w:val="20"/>
-                <w:szCs w:val="20"/>
-              </w:rPr>
-              <w:t xml:space="preserve">3 publishing task definitions</w:t>
-            </w:r>
-          </w:p>
-        </w:tc>
-      </w:tr>
-      <w:tr>
-        <w:tc>
-          <w:tcPr>
-            <w:tcW w:type="dxa" w:w="3600"/>
-            <w:tcBorders>
-              <w:top w:val="single" w:color="CCCCCC" w:sz="1"/>
-              <w:left w:val="single" w:color="CCCCCC" w:sz="1"/>
-              <w:bottom w:val="single" w:color="CCCCCC" w:sz="1"/>
-              <w:right w:val="single" w:color="CCCCCC" w:sz="1"/>
-            </w:tcBorders>
-            <w:shd w:fill="FFFFFF" w:val="clear"/>
-            <w:tcMar>
-              <w:top w:type="dxa" w:w="60"/>
-              <w:left w:type="dxa" w:w="100"/>
-              <w:bottom w:type="dxa" w:w="60"/>
-              <w:right w:type="dxa" w:w="100"/>
-            </w:tcMar>
-          </w:tcPr>
-          <w:p>
-            <w:r>
-              <w:rPr>
-                <w:rFonts w:ascii="Arial" w:cs="Arial" w:eastAsia="Arial" w:hAnsi="Arial"/>
-                <w:color w:val="333333"/>
-                <w:sz w:val="20"/>
-                <w:szCs w:val="20"/>
-              </w:rPr>
-              <w:t xml:space="preserve">src/tools/__init__.py</w:t>
-            </w:r>
-          </w:p>
-        </w:tc>
-        <w:tc>
-          <w:tcPr>
-            <w:tcW w:type="dxa" w:w="5760"/>
-            <w:tcBorders>
-              <w:top w:val="single" w:color="CCCCCC" w:sz="1"/>
-              <w:left w:val="single" w:color="CCCCCC" w:sz="1"/>
-              <w:bottom w:val="single" w:color="CCCCCC" w:sz="1"/>
-              <w:right w:val="single" w:color="CCCCCC" w:sz="1"/>
-            </w:tcBorders>
-            <w:shd w:fill="FFFFFF" w:val="clear"/>
-            <w:tcMar>
-              <w:top w:type="dxa" w:w="60"/>
-              <w:left w:type="dxa" w:w="100"/>
-              <w:bottom w:type="dxa" w:w="60"/>
-              <w:right w:type="dxa" w:w="100"/>
-            </w:tcMar>
-          </w:tcPr>
-          <w:p>
-            <w:r>
-              <w:rPr>
-                <w:rFonts w:ascii="Arial" w:cs="Arial" w:eastAsia="Arial" w:hAnsi="Arial"/>
-                <w:color w:val="333333"/>
-                <w:sz w:val="20"/>
-                <w:szCs w:val="20"/>
-              </w:rPr>
-              <w:t xml:space="preserve">Exports all 7 tool functions</w:t>
-            </w:r>
-          </w:p>
-        </w:tc>
-      </w:tr>
-      <w:tr>
-        <w:tc>
-          <w:tcPr>
-            <w:tcW w:type="dxa" w:w="3600"/>
-            <w:tcBorders>
-              <w:top w:val="single" w:color="CCCCCC" w:sz="1"/>
-              <w:left w:val="single" w:color="CCCCCC" w:sz="1"/>
-              <w:bottom w:val="single" w:color="CCCCCC" w:sz="1"/>
-              <w:right w:val="single" w:color="CCCCCC" w:sz="1"/>
-            </w:tcBorders>
-            <w:shd w:fill="FFFFFF" w:val="clear"/>
-            <w:tcMar>
-              <w:top w:type="dxa" w:w="60"/>
-              <w:left w:type="dxa" w:w="100"/>
-              <w:bottom w:type="dxa" w:w="60"/>
-              <w:right w:type="dxa" w:w="100"/>
-            </w:tcMar>
-          </w:tcPr>
-          <w:p>
-            <w:r>
-              <w:rPr>
-                <w:rFonts w:ascii="Arial" w:cs="Arial" w:eastAsia="Arial" w:hAnsi="Arial"/>
-                <w:color w:val="333333"/>
-                <w:sz w:val="20"/>
-                <w:szCs w:val="20"/>
-              </w:rPr>
-              <w:t xml:space="preserve">src/tools/youtube_tools.py</w:t>
-            </w:r>
-          </w:p>
-        </w:tc>
-        <w:tc>
-          <w:tcPr>
-            <w:tcW w:type="dxa" w:w="5760"/>
-            <w:tcBorders>
-              <w:top w:val="single" w:color="CCCCCC" w:sz="1"/>
-              <w:left w:val="single" w:color="CCCCCC" w:sz="1"/>
-              <w:bottom w:val="single" w:color="CCCCCC" w:sz="1"/>
-              <w:right w:val="single" w:color="CCCCCC" w:sz="1"/>
-            </w:tcBorders>
-            <w:shd w:fill="FFFFFF" w:val="clear"/>
-            <w:tcMar>
-              <w:top w:type="dxa" w:w="60"/>
-              <w:left w:type="dxa" w:w="100"/>
-              <w:bottom w:type="dxa" w:w="60"/>
-              <w:right w:type="dxa" w:w="100"/>
-            </w:tcMar>
-          </w:tcPr>
-          <w:p>
-            <w:r>
-              <w:rPr>
-                <w:rFonts w:ascii="Arial" w:cs="Arial" w:eastAsia="Arial" w:hAnsi="Arial"/>
-                <w:color w:val="333333"/>
-                <w:sz w:val="20"/>
-                <w:szCs w:val="20"/>
-              </w:rPr>
-              <w:t xml:space="preserve">YouTube Data API v3 search + transcript extraction</w:t>
-            </w:r>
-          </w:p>
-        </w:tc>
-      </w:tr>
-      <w:tr>
-        <w:tc>
-          <w:tcPr>
-            <w:tcW w:type="dxa" w:w="3600"/>
-            <w:tcBorders>
-              <w:top w:val="single" w:color="CCCCCC" w:sz="1"/>
-              <w:left w:val="single" w:color="CCCCCC" w:sz="1"/>
-              <w:bottom w:val="single" w:color="CCCCCC" w:sz="1"/>
-              <w:right w:val="single" w:color="CCCCCC" w:sz="1"/>
-            </w:tcBorders>
-            <w:shd w:fill="FFFFFF" w:val="clear"/>
-            <w:tcMar>
-              <w:top w:type="dxa" w:w="60"/>
-              <w:left w:type="dxa" w:w="100"/>
-              <w:bottom w:type="dxa" w:w="60"/>
-              <w:right w:type="dxa" w:w="100"/>
-            </w:tcMar>
-          </w:tcPr>
-          <w:p>
-            <w:r>
-              <w:rPr>
-                <w:rFonts w:ascii="Arial" w:cs="Arial" w:eastAsia="Arial" w:hAnsi="Arial"/>
-                <w:color w:val="333333"/>
-                <w:sz w:val="20"/>
-                <w:szCs w:val="20"/>
-              </w:rPr>
-              <w:t xml:space="preserve">src/tools/twitter_tools.py</w:t>
-            </w:r>
-          </w:p>
-        </w:tc>
-        <w:tc>
-          <w:tcPr>
-            <w:tcW w:type="dxa" w:w="5760"/>
-            <w:tcBorders>
-              <w:top w:val="single" w:color="CCCCCC" w:sz="1"/>
-              <w:left w:val="single" w:color="CCCCCC" w:sz="1"/>
-              <w:bottom w:val="single" w:color="CCCCCC" w:sz="1"/>
-              <w:right w:val="single" w:color="CCCCCC" w:sz="1"/>
-            </w:tcBorders>
-            <w:shd w:fill="FFFFFF" w:val="clear"/>
-            <w:tcMar>
-              <w:top w:type="dxa" w:w="60"/>
-              <w:left w:type="dxa" w:w="100"/>
-              <w:bottom w:type="dxa" w:w="60"/>
-              <w:right w:type="dxa" w:w="100"/>
-            </w:tcMar>
-          </w:tcPr>
-          <w:p>
-            <w:r>
-              <w:rPr>
-                <w:rFonts w:ascii="Arial" w:cs="Arial" w:eastAsia="Arial" w:hAnsi="Arial"/>
-                <w:color w:val="333333"/>
-                <w:sz w:val="20"/>
-                <w:szCs w:val="20"/>
-              </w:rPr>
-              <w:t xml:space="preserve">X/Twitter API v2 search + OAuth1 tweet posting</w:t>
-            </w:r>
-          </w:p>
-        </w:tc>
-      </w:tr>
-      <w:tr>
-        <w:tc>
-          <w:tcPr>
-            <w:tcW w:type="dxa" w:w="3600"/>
-            <w:tcBorders>
-              <w:top w:val="single" w:color="CCCCCC" w:sz="1"/>
-              <w:left w:val="single" w:color="CCCCCC" w:sz="1"/>
-              <w:bottom w:val="single" w:color="CCCCCC" w:sz="1"/>
-              <w:right w:val="single" w:color="CCCCCC" w:sz="1"/>
-            </w:tcBorders>
-            <w:shd w:fill="FFFFFF" w:val="clear"/>
-            <w:tcMar>
-              <w:top w:type="dxa" w:w="60"/>
-              <w:left w:type="dxa" w:w="100"/>
-              <w:bottom w:type="dxa" w:w="60"/>
-              <w:right w:type="dxa" w:w="100"/>
-            </w:tcMar>
-          </w:tcPr>
-          <w:p>
-            <w:r>
-              <w:rPr>
-                <w:rFonts w:ascii="Arial" w:cs="Arial" w:eastAsia="Arial" w:hAnsi="Arial"/>
-                <w:color w:val="333333"/>
-                <w:sz w:val="20"/>
-                <w:szCs w:val="20"/>
-              </w:rPr>
-              <w:t xml:space="preserve">src/tools/medium_tools.py</w:t>
-            </w:r>
-          </w:p>
-        </w:tc>
-        <w:tc>
-          <w:tcPr>
-            <w:tcW w:type="dxa" w:w="5760"/>
-            <w:tcBorders>
-              <w:top w:val="single" w:color="CCCCCC" w:sz="1"/>
-              <w:left w:val="single" w:color="CCCCCC" w:sz="1"/>
-              <w:bottom w:val="single" w:color="CCCCCC" w:sz="1"/>
-              <w:right w:val="single" w:color="CCCCCC" w:sz="1"/>
-            </w:tcBorders>
-            <w:shd w:fill="FFFFFF" w:val="clear"/>
-            <w:tcMar>
-              <w:top w:type="dxa" w:w="60"/>
-              <w:left w:type="dxa" w:w="100"/>
-              <w:bottom w:type="dxa" w:w="60"/>
-              <w:right w:type="dxa" w:w="100"/>
-            </w:tcMar>
-          </w:tcPr>
-          <w:p>
-            <w:r>
-              <w:rPr>
-                <w:rFonts w:ascii="Arial" w:cs="Arial" w:eastAsia="Arial" w:hAnsi="Arial"/>
-                <w:color w:val="333333"/>
-                <w:sz w:val="20"/>
-                <w:szCs w:val="20"/>
-              </w:rPr>
-              <w:t xml:space="preserve">Medium REST API publishing (draft or public)</w:t>
-            </w:r>
-          </w:p>
-        </w:tc>
-      </w:tr>
-      <w:tr>
-        <w:tc>
-          <w:tcPr>
-            <w:tcW w:type="dxa" w:w="3600"/>
-            <w:tcBorders>
-              <w:top w:val="single" w:color="CCCCCC" w:sz="1"/>
-              <w:left w:val="single" w:color="CCCCCC" w:sz="1"/>
-              <w:bottom w:val="single" w:color="CCCCCC" w:sz="1"/>
-              <w:right w:val="single" w:color="CCCCCC" w:sz="1"/>
-            </w:tcBorders>
-            <w:shd w:fill="FFFFFF" w:val="clear"/>
-            <w:tcMar>
-              <w:top w:type="dxa" w:w="60"/>
-              <w:left w:type="dxa" w:w="100"/>
-              <w:bottom w:type="dxa" w:w="60"/>
-              <w:right w:type="dxa" w:w="100"/>
-            </w:tcMar>
-          </w:tcPr>
-          <w:p>
-            <w:r>
-              <w:rPr>
-                <w:rFonts w:ascii="Arial" w:cs="Arial" w:eastAsia="Arial" w:hAnsi="Arial"/>
-                <w:color w:val="333333"/>
-                <w:sz w:val="20"/>
-                <w:szCs w:val="20"/>
-              </w:rPr>
-              <w:t xml:space="preserve">src/tools/discord_tools.py</w:t>
-            </w:r>
-          </w:p>
-        </w:tc>
-        <w:tc>
-          <w:tcPr>
-            <w:tcW w:type="dxa" w:w="5760"/>
-            <w:tcBorders>
-              <w:top w:val="single" w:color="CCCCCC" w:sz="1"/>
-              <w:left w:val="single" w:color="CCCCCC" w:sz="1"/>
-              <w:bottom w:val="single" w:color="CCCCCC" w:sz="1"/>
-              <w:right w:val="single" w:color="CCCCCC" w:sz="1"/>
-            </w:tcBorders>
-            <w:shd w:fill="FFFFFF" w:val="clear"/>
-            <w:tcMar>
-              <w:top w:type="dxa" w:w="60"/>
-              <w:left w:type="dxa" w:w="100"/>
-              <w:bottom w:type="dxa" w:w="60"/>
-              <w:right w:type="dxa" w:w="100"/>
-            </w:tcMar>
-          </w:tcPr>
-          <w:p>
-            <w:r>
-              <w:rPr>
-                <w:rFonts w:ascii="Arial" w:cs="Arial" w:eastAsia="Arial" w:hAnsi="Arial"/>
-                <w:color w:val="333333"/>
-                <w:sz w:val="20"/>
-                <w:szCs w:val="20"/>
-              </w:rPr>
-              <w:t xml:space="preserve">Discord webhook rich embed posting</w:t>
-            </w:r>
-          </w:p>
-        </w:tc>
-      </w:tr>
-      <w:tr>
-        <w:tc>
-          <w:tcPr>
-            <w:tcW w:type="dxa" w:w="3600"/>
-            <w:tcBorders>
-              <w:top w:val="single" w:color="CCCCCC" w:sz="1"/>
-              <w:left w:val="single" w:color="CCCCCC" w:sz="1"/>
-              <w:bottom w:val="single" w:color="CCCCCC" w:sz="1"/>
-              <w:right w:val="single" w:color="CCCCCC" w:sz="1"/>
-            </w:tcBorders>
-            <w:shd w:fill="FFFFFF" w:val="clear"/>
-            <w:tcMar>
-              <w:top w:type="dxa" w:w="60"/>
-              <w:left w:type="dxa" w:w="100"/>
-              <w:bottom w:type="dxa" w:w="60"/>
-              <w:right w:type="dxa" w:w="100"/>
-            </w:tcMar>
-          </w:tcPr>
-          <w:p>
-            <w:r>
-              <w:rPr>
-                <w:rFonts w:ascii="Arial" w:cs="Arial" w:eastAsia="Arial" w:hAnsi="Arial"/>
-                <w:color w:val="333333"/>
-                <w:sz w:val="20"/>
-                <w:szCs w:val="20"/>
-              </w:rPr>
-              <w:t xml:space="preserve">src/tools/web_scraper_tools.py</w:t>
-            </w:r>
-          </w:p>
-        </w:tc>
-        <w:tc>
-          <w:tcPr>
-            <w:tcW w:type="dxa" w:w="5760"/>
-            <w:tcBorders>
-              <w:top w:val="single" w:color="CCCCCC" w:sz="1"/>
-              <w:left w:val="single" w:color="CCCCCC" w:sz="1"/>
-              <w:bottom w:val="single" w:color="CCCCCC" w:sz="1"/>
-              <w:right w:val="single" w:color="CCCCCC" w:sz="1"/>
-            </w:tcBorders>
-            <w:shd w:fill="FFFFFF" w:val="clear"/>
-            <w:tcMar>
-              <w:top w:type="dxa" w:w="60"/>
-              <w:left w:type="dxa" w:w="100"/>
-              <w:bottom w:type="dxa" w:w="60"/>
-              <w:right w:type="dxa" w:w="100"/>
-            </w:tcMar>
-          </w:tcPr>
-          <w:p>
-            <w:r>
-              <w:rPr>
-                <w:rFonts w:ascii="Arial" w:cs="Arial" w:eastAsia="Arial" w:hAnsi="Arial"/>
-                <w:color w:val="333333"/>
-                <w:sz w:val="20"/>
-                <w:szCs w:val="20"/>
-              </w:rPr>
-              <w:t xml:space="preserve">BeautifulSoup scraper for hedera.com/blog</w:t>
-            </w:r>
-          </w:p>
-        </w:tc>
-      </w:tr>
-      <w:tr>
-        <w:tc>
-          <w:tcPr>
-            <w:tcW w:type="dxa" w:w="3600"/>
-            <w:tcBorders>
-              <w:top w:val="single" w:color="CCCCCC" w:sz="1"/>
-              <w:left w:val="single" w:color="CCCCCC" w:sz="1"/>
-              <w:bottom w:val="single" w:color="CCCCCC" w:sz="1"/>
-              <w:right w:val="single" w:color="CCCCCC" w:sz="1"/>
-            </w:tcBorders>
-            <w:shd w:fill="FFFFFF" w:val="clear"/>
-            <w:tcMar>
-              <w:top w:type="dxa" w:w="60"/>
-              <w:left w:type="dxa" w:w="100"/>
-              <w:bottom w:type="dxa" w:w="60"/>
-              <w:right w:type="dxa" w:w="100"/>
-            </w:tcMar>
-          </w:tcPr>
-          <w:p>
-            <w:r>
-              <w:rPr>
-                <w:rFonts w:ascii="Arial" w:cs="Arial" w:eastAsia="Arial" w:hAnsi="Arial"/>
-                <w:color w:val="333333"/>
-                <w:sz w:val="20"/>
-                <w:szCs w:val="20"/>
-              </w:rPr>
-              <w:t xml:space="preserve">src/prompts/__init__.py</w:t>
-            </w:r>
-          </w:p>
-        </w:tc>
-        <w:tc>
-          <w:tcPr>
-            <w:tcW w:type="dxa" w:w="5760"/>
-            <w:tcBorders>
-              <w:top w:val="single" w:color="CCCCCC" w:sz="1"/>
-              <w:left w:val="single" w:color="CCCCCC" w:sz="1"/>
-              <w:bottom w:val="single" w:color="CCCCCC" w:sz="1"/>
-              <w:right w:val="single" w:color="CCCCCC" w:sz="1"/>
-            </w:tcBorders>
-            <w:shd w:fill="FFFFFF" w:val="clear"/>
-            <w:tcMar>
-              <w:top w:type="dxa" w:w="60"/>
-              <w:left w:type="dxa" w:w="100"/>
-              <w:bottom w:type="dxa" w:w="60"/>
-              <w:right w:type="dxa" w:w="100"/>
-            </w:tcMar>
-          </w:tcPr>
-          <w:p>
-            <w:r>
-              <w:rPr>
-                <w:rFonts w:ascii="Arial" w:cs="Arial" w:eastAsia="Arial" w:hAnsi="Arial"/>
-                <w:color w:val="333333"/>
-                <w:sz w:val="20"/>
-                <w:szCs w:val="20"/>
-              </w:rPr>
-              <w:t xml:space="preserve">Package init</w:t>
-            </w:r>
-          </w:p>
-        </w:tc>
-      </w:tr>
-      <w:tr>
-        <w:tc>
-          <w:tcPr>
-            <w:tcW w:type="dxa" w:w="3600"/>
-            <w:tcBorders>
-              <w:top w:val="single" w:color="CCCCCC" w:sz="1"/>
-              <w:left w:val="single" w:color="CCCCCC" w:sz="1"/>
-              <w:bottom w:val="single" w:color="CCCCCC" w:sz="1"/>
-              <w:right w:val="single" w:color="CCCCCC" w:sz="1"/>
-            </w:tcBorders>
-            <w:shd w:fill="FFFFFF" w:val="clear"/>
-            <w:tcMar>
-              <w:top w:type="dxa" w:w="60"/>
-              <w:left w:type="dxa" w:w="100"/>
-              <w:bottom w:type="dxa" w:w="60"/>
-              <w:right w:type="dxa" w:w="100"/>
-            </w:tcMar>
-          </w:tcPr>
-          <w:p>
-            <w:r>
-              <w:rPr>
-                <w:rFonts w:ascii="Arial" w:cs="Arial" w:eastAsia="Arial" w:hAnsi="Arial"/>
-                <w:color w:val="333333"/>
-                <w:sz w:val="20"/>
-                <w:szCs w:val="20"/>
-              </w:rPr>
-              <w:t xml:space="preserve">src/prompts/templates.py</w:t>
-            </w:r>
-          </w:p>
-        </w:tc>
-        <w:tc>
-          <w:tcPr>
-            <w:tcW w:type="dxa" w:w="5760"/>
-            <w:tcBorders>
-              <w:top w:val="single" w:color="CCCCCC" w:sz="1"/>
-              <w:left w:val="single" w:color="CCCCCC" w:sz="1"/>
-              <w:bottom w:val="single" w:color="CCCCCC" w:sz="1"/>
-              <w:right w:val="single" w:color="CCCCCC" w:sz="1"/>
-            </w:tcBorders>
-            <w:shd w:fill="FFFFFF" w:val="clear"/>
-            <w:tcMar>
-              <w:top w:type="dxa" w:w="60"/>
-              <w:left w:type="dxa" w:w="100"/>
-              <w:bottom w:type="dxa" w:w="60"/>
-              <w:right w:type="dxa" w:w="100"/>
-            </w:tcMar>
-          </w:tcPr>
-          <w:p>
-            <w:r>
-              <w:rPr>
-                <w:rFonts w:ascii="Arial" w:cs="Arial" w:eastAsia="Arial" w:hAnsi="Arial"/>
-                <w:color w:val="333333"/>
-                <w:sz w:val="20"/>
-                <w:szCs w:val="20"/>
-              </w:rPr>
-              <w:t xml:space="preserve">5 prompt templates with language support</w:t>
-            </w:r>
-          </w:p>
-        </w:tc>
-      </w:tr>
-      <w:tr>
-        <w:tc>
-          <w:tcPr>
-            <w:tcW w:type="dxa" w:w="3600"/>
-            <w:tcBorders>
-              <w:top w:val="single" w:color="CCCCCC" w:sz="1"/>
-              <w:left w:val="single" w:color="CCCCCC" w:sz="1"/>
-              <w:bottom w:val="single" w:color="CCCCCC" w:sz="1"/>
-              <w:right w:val="single" w:color="CCCCCC" w:sz="1"/>
-            </w:tcBorders>
-            <w:shd w:fill="FFFFFF" w:val="clear"/>
-            <w:tcMar>
-              <w:top w:type="dxa" w:w="60"/>
-              <w:left w:type="dxa" w:w="100"/>
-              <w:bottom w:type="dxa" w:w="60"/>
-              <w:right w:type="dxa" w:w="100"/>
-            </w:tcMar>
-          </w:tcPr>
-          <w:p>
-            <w:r>
-              <w:rPr>
-                <w:rFonts w:ascii="Arial" w:cs="Arial" w:eastAsia="Arial" w:hAnsi="Arial"/>
-                <w:color w:val="333333"/>
-                <w:sz w:val="20"/>
-                <w:szCs w:val="20"/>
-              </w:rPr>
-              <w:t xml:space="preserve">tests/__init__.py</w:t>
-            </w:r>
-          </w:p>
-        </w:tc>
-        <w:tc>
-          <w:tcPr>
-            <w:tcW w:type="dxa" w:w="5760"/>
-            <w:tcBorders>
-              <w:top w:val="single" w:color="CCCCCC" w:sz="1"/>
-              <w:left w:val="single" w:color="CCCCCC" w:sz="1"/>
-              <w:bottom w:val="single" w:color="CCCCCC" w:sz="1"/>
-              <w:right w:val="single" w:color="CCCCCC" w:sz="1"/>
-            </w:tcBorders>
-            <w:shd w:fill="FFFFFF" w:val="clear"/>
-            <w:tcMar>
-              <w:top w:type="dxa" w:w="60"/>
-              <w:left w:type="dxa" w:w="100"/>
-              <w:bottom w:type="dxa" w:w="60"/>
-              <w:right w:type="dxa" w:w="100"/>
-            </w:tcMar>
-          </w:tcPr>
-          <w:p>
-            <w:r>
-              <w:rPr>
-                <w:rFonts w:ascii="Arial" w:cs="Arial" w:eastAsia="Arial" w:hAnsi="Arial"/>
-                <w:color w:val="333333"/>
-                <w:sz w:val="20"/>
-                <w:szCs w:val="20"/>
-              </w:rPr>
-              <w:t xml:space="preserve">Package init</w:t>
-            </w:r>
-          </w:p>
-        </w:tc>
-      </w:tr>
-      <w:tr>
-        <w:tc>
-          <w:tcPr>
-            <w:tcW w:type="dxa" w:w="3600"/>
-            <w:tcBorders>
-              <w:top w:val="single" w:color="CCCCCC" w:sz="1"/>
-              <w:left w:val="single" w:color="CCCCCC" w:sz="1"/>
-              <w:bottom w:val="single" w:color="CCCCCC" w:sz="1"/>
-              <w:right w:val="single" w:color="CCCCCC" w:sz="1"/>
-            </w:tcBorders>
-            <w:shd w:fill="FFFFFF" w:val="clear"/>
-            <w:tcMar>
-              <w:top w:type="dxa" w:w="60"/>
-              <w:left w:type="dxa" w:w="100"/>
-              <w:bottom w:type="dxa" w:w="60"/>
-              <w:right w:type="dxa" w:w="100"/>
-            </w:tcMar>
-          </w:tcPr>
-          <w:p>
-            <w:r>
-              <w:rPr>
-                <w:rFonts w:ascii="Arial" w:cs="Arial" w:eastAsia="Arial" w:hAnsi="Arial"/>
-                <w:color w:val="333333"/>
-                <w:sz w:val="20"/>
-                <w:szCs w:val="20"/>
-              </w:rPr>
-              <w:t xml:space="preserve">tests/conftest.py</w:t>
-            </w:r>
-          </w:p>
-        </w:tc>
-        <w:tc>
-          <w:tcPr>
-            <w:tcW w:type="dxa" w:w="5760"/>
-            <w:tcBorders>
-              <w:top w:val="single" w:color="CCCCCC" w:sz="1"/>
-              <w:left w:val="single" w:color="CCCCCC" w:sz="1"/>
-              <w:bottom w:val="single" w:color="CCCCCC" w:sz="1"/>
-              <w:right w:val="single" w:color="CCCCCC" w:sz="1"/>
-            </w:tcBorders>
-            <w:shd w:fill="FFFFFF" w:val="clear"/>
-            <w:tcMar>
-              <w:top w:type="dxa" w:w="60"/>
-              <w:left w:type="dxa" w:w="100"/>
-              <w:bottom w:type="dxa" w:w="60"/>
-              <w:right w:type="dxa" w:w="100"/>
-            </w:tcMar>
-          </w:tcPr>
-          <w:p>
-            <w:r>
-              <w:rPr>
-                <w:rFonts w:ascii="Arial" w:cs="Arial" w:eastAsia="Arial" w:hAnsi="Arial"/>
-                <w:color w:val="333333"/>
-                <w:sz w:val="20"/>
-                <w:szCs w:val="20"/>
-              </w:rPr>
-              <w:t xml:space="preserve">Shared pytest fixtures (5 sample responses)</w:t>
-            </w:r>
-          </w:p>
-        </w:tc>
-      </w:tr>
-      <w:tr>
-        <w:tc>
-          <w:tcPr>
-            <w:tcW w:type="dxa" w:w="3600"/>
-            <w:tcBorders>
-              <w:top w:val="single" w:color="CCCCCC" w:sz="1"/>
-              <w:left w:val="single" w:color="CCCCCC" w:sz="1"/>
-              <w:bottom w:val="single" w:color="CCCCCC" w:sz="1"/>
-              <w:right w:val="single" w:color="CCCCCC" w:sz="1"/>
-            </w:tcBorders>
-            <w:shd w:fill="FFFFFF" w:val="clear"/>
-            <w:tcMar>
-              <w:top w:type="dxa" w:w="60"/>
-              <w:left w:type="dxa" w:w="100"/>
-              <w:bottom w:type="dxa" w:w="60"/>
-              <w:right w:type="dxa" w:w="100"/>
-            </w:tcMar>
-          </w:tcPr>
-          <w:p>
-            <w:r>
-              <w:rPr>
-                <w:rFonts w:ascii="Arial" w:cs="Arial" w:eastAsia="Arial" w:hAnsi="Arial"/>
-                <w:color w:val="333333"/>
-                <w:sz w:val="20"/>
-                <w:szCs w:val="20"/>
-              </w:rPr>
-              <w:t xml:space="preserve">tests/test_models.py</w:t>
-            </w:r>
-          </w:p>
-        </w:tc>
-        <w:tc>
-          <w:tcPr>
-            <w:tcW w:type="dxa" w:w="5760"/>
-            <w:tcBorders>
-              <w:top w:val="single" w:color="CCCCCC" w:sz="1"/>
-              <w:left w:val="single" w:color="CCCCCC" w:sz="1"/>
-              <w:bottom w:val="single" w:color="CCCCCC" w:sz="1"/>
-              <w:right w:val="single" w:color="CCCCCC" w:sz="1"/>
-            </w:tcBorders>
-            <w:shd w:fill="FFFFFF" w:val="clear"/>
-            <w:tcMar>
-              <w:top w:type="dxa" w:w="60"/>
-              <w:left w:type="dxa" w:w="100"/>
-              <w:bottom w:type="dxa" w:w="60"/>
-              <w:right w:type="dxa" w:w="100"/>
-            </w:tcMar>
-          </w:tcPr>
-          <w:p>
-            <w:r>
-              <w:rPr>
-                <w:rFonts w:ascii="Arial" w:cs="Arial" w:eastAsia="Arial" w:hAnsi="Arial"/>
-                <w:color w:val="333333"/>
-                <w:sz w:val="20"/>
-                <w:szCs w:val="20"/>
-              </w:rPr>
-              <w:t xml:space="preserve">16 Pydantic model tests including Spanish language</w:t>
-            </w:r>
-          </w:p>
-        </w:tc>
-      </w:tr>
-      <w:tr>
-        <w:tc>
-          <w:tcPr>
-            <w:tcW w:type="dxa" w:w="3600"/>
-            <w:tcBorders>
-              <w:top w:val="single" w:color="CCCCCC" w:sz="1"/>
-              <w:left w:val="single" w:color="CCCCCC" w:sz="1"/>
-              <w:bottom w:val="single" w:color="CCCCCC" w:sz="1"/>
-              <w:right w:val="single" w:color="CCCCCC" w:sz="1"/>
-            </w:tcBorders>
-            <w:shd w:fill="FFFFFF" w:val="clear"/>
-            <w:tcMar>
-              <w:top w:type="dxa" w:w="60"/>
-              <w:left w:type="dxa" w:w="100"/>
-              <w:bottom w:type="dxa" w:w="60"/>
-              <w:right w:type="dxa" w:w="100"/>
-            </w:tcMar>
-          </w:tcPr>
-          <w:p>
-            <w:r>
-              <w:rPr>
-                <w:rFonts w:ascii="Arial" w:cs="Arial" w:eastAsia="Arial" w:hAnsi="Arial"/>
-                <w:color w:val="333333"/>
-                <w:sz w:val="20"/>
-                <w:szCs w:val="20"/>
-              </w:rPr>
-              <w:t xml:space="preserve">tests/test_tools.py</w:t>
-            </w:r>
-          </w:p>
-        </w:tc>
-        <w:tc>
-          <w:tcPr>
-            <w:tcW w:type="dxa" w:w="5760"/>
-            <w:tcBorders>
-              <w:top w:val="single" w:color="CCCCCC" w:sz="1"/>
-              <w:left w:val="single" w:color="CCCCCC" w:sz="1"/>
-              <w:bottom w:val="single" w:color="CCCCCC" w:sz="1"/>
-              <w:right w:val="single" w:color="CCCCCC" w:sz="1"/>
-            </w:tcBorders>
-            <w:shd w:fill="FFFFFF" w:val="clear"/>
-            <w:tcMar>
-              <w:top w:type="dxa" w:w="60"/>
-              <w:left w:type="dxa" w:w="100"/>
-              <w:bottom w:type="dxa" w:w="60"/>
-              <w:right w:type="dxa" w:w="100"/>
-            </w:tcMar>
-          </w:tcPr>
-          <w:p>
-            <w:r>
-              <w:rPr>
-                <w:rFonts w:ascii="Arial" w:cs="Arial" w:eastAsia="Arial" w:hAnsi="Arial"/>
-                <w:color w:val="333333"/>
-                <w:sz w:val="20"/>
-                <w:szCs w:val="20"/>
-              </w:rPr>
-              <w:t xml:space="preserve">19 tool tests with mocked API calls</w:t>
-            </w:r>
-          </w:p>
-        </w:tc>
-      </w:tr>
-      <w:tr>
-        <w:tc>
-          <w:tcPr>
-            <w:tcW w:type="dxa" w:w="3600"/>
-            <w:tcBorders>
-              <w:top w:val="single" w:color="CCCCCC" w:sz="1"/>
-              <w:left w:val="single" w:color="CCCCCC" w:sz="1"/>
-              <w:bottom w:val="single" w:color="CCCCCC" w:sz="1"/>
-              <w:right w:val="single" w:color="CCCCCC" w:sz="1"/>
-            </w:tcBorders>
-            <w:shd w:fill="FFFFFF" w:val="clear"/>
-            <w:tcMar>
-              <w:top w:type="dxa" w:w="60"/>
-              <w:left w:type="dxa" w:w="100"/>
-              <w:bottom w:type="dxa" w:w="60"/>
-              <w:right w:type="dxa" w:w="100"/>
-            </w:tcMar>
-          </w:tcPr>
-          <w:p>
-            <w:r>
-              <w:rPr>
-                <w:rFonts w:ascii="Arial" w:cs="Arial" w:eastAsia="Arial" w:hAnsi="Arial"/>
-                <w:color w:val="333333"/>
-                <w:sz w:val="20"/>
-                <w:szCs w:val="20"/>
-              </w:rPr>
-              <w:t xml:space="preserve">tests/test_crew.py</w:t>
-            </w:r>
-          </w:p>
-        </w:tc>
-        <w:tc>
-          <w:tcPr>
-            <w:tcW w:type="dxa" w:w="5760"/>
-            <w:tcBorders>
-              <w:top w:val="single" w:color="CCCCCC" w:sz="1"/>
-              <w:left w:val="single" w:color="CCCCCC" w:sz="1"/>
-              <w:bottom w:val="single" w:color="CCCCCC" w:sz="1"/>
-              <w:right w:val="single" w:color="CCCCCC" w:sz="1"/>
-            </w:tcBorders>
-            <w:shd w:fill="FFFFFF" w:val="clear"/>
-            <w:tcMar>
-              <w:top w:type="dxa" w:w="60"/>
-              <w:left w:type="dxa" w:w="100"/>
-              <w:bottom w:type="dxa" w:w="60"/>
-              <w:right w:type="dxa" w:w="100"/>
-            </w:tcMar>
-          </w:tcPr>
-          <w:p>
-            <w:r>
-              <w:rPr>
-                <w:rFonts w:ascii="Arial" w:cs="Arial" w:eastAsia="Arial" w:hAnsi="Arial"/>
-                <w:color w:val="333333"/>
-                <w:sz w:val="20"/>
-                <w:szCs w:val="20"/>
-              </w:rPr>
-              <w:t xml:space="preserve">9 crew integration tests</w:t>
+              <w:t xml:space="preserve">Design document (this file)</w:t>
             </w:r>
           </w:p>
         </w:tc>
@@ -13657,7 +12683,7 @@
           <w:sz w:val="22"/>
           <w:szCs w:val="22"/>
         </w:rPr>
-        <w:t xml:space="preserve">1. Add the language code and writing instruction to LANGUAGE_INSTRUCTIONS in src/prompts/templates.py (e.g., 'pt' for Portuguese).</w:t>
+        <w:t xml:space="preserve">1. Add the language code and instruction to LANGUAGE_INSTRUCTIONS in src/prompts/templates.py.</w:t>
       </w:r>
     </w:p>
     <w:p>
@@ -13671,7 +12697,7 @@
           <w:sz w:val="22"/>
           <w:szCs w:val="22"/>
         </w:rPr>
-        <w:t xml:space="preserve">2. Add the new choice to the --language argument in main.py.</w:t>
+        <w:t xml:space="preserve">2. Add the choice to the --language argument in main.py.</w:t>
       </w:r>
     </w:p>
     <w:p>
@@ -13685,7 +12711,7 @@
           <w:sz w:val="22"/>
           <w:szCs w:val="22"/>
         </w:rPr>
-        <w:t xml:space="preserve">3. Update the writer agent backstory in src/config/writing_agents.yaml to mention the new language.</w:t>
+        <w:t xml:space="preserve">3. Update the writer agent backstory in src/config/writing_agents.yaml.</w:t>
       </w:r>
     </w:p>
     <w:p>
@@ -13712,7 +12738,7 @@
           <w:sz w:val="22"/>
           <w:szCs w:val="22"/>
         </w:rPr>
-        <w:t xml:space="preserve">1. Create a new tool file in src/tools/ using the @tool decorator pattern (see existing tools for reference).</w:t>
+        <w:t xml:space="preserve">1. Create a new tool file in src/tools/ using the @tool decorator pattern.</w:t>
       </w:r>
     </w:p>
     <w:p>
@@ -13726,7 +12752,7 @@
           <w:sz w:val="22"/>
           <w:szCs w:val="22"/>
         </w:rPr>
-        <w:t xml:space="preserve">2. Create new agent and task YAML files in src/config/ for the research crew.</w:t>
+        <w:t xml:space="preserve">2. Create new agent and task YAML files in src/config/.</w:t>
       </w:r>
     </w:p>
     <w:p>
@@ -13740,7 +12766,20 @@
           <w:sz w:val="22"/>
           <w:szCs w:val="22"/>
         </w:rPr>
-        <w:t xml:space="preserve">3. Add the agent and task to ResearchCrew in src/crew.py.</w:t>
+        <w:t xml:space="preserve">3. Add the agent and task to the appropriate crew in src/crew.py.</w:t>
+      </w:r>
+    </w:p>
+    <w:p>
+      <w:pPr>
+        <w:spacing w:after="200"/>
+      </w:pPr>
+    </w:p>
+    <w:p>
+      <w:pPr>
+        <w:pStyle w:val="Heading2"/>
+      </w:pPr>
+      <w:r>
+        <w:t xml:space="preserve">Adding a New Publishing Platform</w:t>
       </w:r>
     </w:p>
     <w:p>
@@ -13754,34 +12793,7 @@
           <w:sz w:val="22"/>
           <w:szCs w:val="22"/>
         </w:rPr>
-        <w:t xml:space="preserve">4. Update the research YAML config to include the new agent/task definitions.</w:t>
-      </w:r>
-    </w:p>
-    <w:p>
-      <w:pPr>
-        <w:spacing w:after="200"/>
-      </w:pPr>
-    </w:p>
-    <w:p>
-      <w:pPr>
-        <w:pStyle w:val="Heading2"/>
-      </w:pPr>
-      <w:r>
-        <w:t xml:space="preserve">Adding a New Publishing Platform</w:t>
-      </w:r>
-    </w:p>
-    <w:p>
-      <w:pPr>
-        <w:spacing w:after="120"/>
-      </w:pPr>
-      <w:r>
-        <w:rPr>
-          <w:rFonts w:ascii="Arial" w:cs="Arial" w:eastAsia="Arial" w:hAnsi="Arial"/>
-          <w:color w:val="333333"/>
-          <w:sz w:val="22"/>
-          <w:szCs w:val="22"/>
-        </w:rPr>
-        <w:t xml:space="preserve">1. Create a new tool in src/tools/ (e.g., linkedin_tools.py) with a publish function.</w:t>
+        <w:t xml:space="preserve">1. Create a new tool in src/tools/ (e.g., linkedin_tools.py).</w:t>
       </w:r>
     </w:p>
     <w:p>
@@ -13809,7 +12821,20 @@
           <w:sz w:val="22"/>
           <w:szCs w:val="22"/>
         </w:rPr>
-        <w:t xml:space="preserve">3. Add the tool to the content_publisher agent in PublishingCrew (src/crew.py).</w:t>
+        <w:t xml:space="preserve">3. Add the tool to the content_publisher agent in PublishingCrew.</w:t>
+      </w:r>
+    </w:p>
+    <w:p>
+      <w:pPr>
+        <w:spacing w:after="200"/>
+      </w:pPr>
+    </w:p>
+    <w:p>
+      <w:pPr>
+        <w:pStyle w:val="Heading2"/>
+      </w:pPr>
+      <w:r>
+        <w:t xml:space="preserve">Changing the LLM Model</w:t>
       </w:r>
     </w:p>
     <w:p>
@@ -13823,7 +12848,7 @@
           <w:sz w:val="22"/>
           <w:szCs w:val="22"/>
         </w:rPr>
-        <w:t xml:space="preserve">4. Optionally add a corresponding writing task for platform-specific formatting.</w:t>
+        <w:t xml:space="preserve">Set OPENAI_MODEL in .env. The model string is prefixed with 'openai/' and passed to CrewAI's LLM class. Supported: gpt-4o-mini (default), gpt-4o, gpt-5.1.</w:t>
       </w:r>
     </w:p>
     <w:p>
@@ -13833,10 +12858,10 @@
     </w:p>
     <w:p>
       <w:pPr>
-        <w:pStyle w:val="Heading2"/>
+        <w:pStyle w:val="Heading1"/>
       </w:pPr>
       <w:r>
-        <w:t xml:space="preserve">Changing the LLM Model</w:t>
+        <w:t xml:space="preserve">Authors</w:t>
       </w:r>
     </w:p>
     <w:p>
@@ -13850,34 +12875,7 @@
           <w:sz w:val="22"/>
           <w:szCs w:val="22"/>
         </w:rPr>
-        <w:t xml:space="preserve">Set the OPENAI_MODEL environment variable in .env. The model string is prefixed with 'openai/' and passed to CrewAI's LLM class. Supported values include gpt-4o-mini (default, balanced), gpt-4o (more capable), and gpt-5.1 (latest).</w:t>
-      </w:r>
-    </w:p>
-    <w:p>
-      <w:pPr>
-        <w:spacing w:after="200"/>
-      </w:pPr>
-    </w:p>
-    <w:p>
-      <w:pPr>
-        <w:pStyle w:val="Heading2"/>
-      </w:pPr>
-      <w:r>
-        <w:t xml:space="preserve">Adjusting Content Style</w:t>
-      </w:r>
-    </w:p>
-    <w:p>
-      <w:pPr>
-        <w:spacing w:after="120"/>
-      </w:pPr>
-      <w:r>
-        <w:rPr>
-          <w:rFonts w:ascii="Arial" w:cs="Arial" w:eastAsia="Arial" w:hAnsi="Arial"/>
-          <w:color w:val="333333"/>
-          <w:sz w:val="22"/>
-          <w:szCs w:val="22"/>
-        </w:rPr>
-        <w:t xml:space="preserve">Edit the prompt templates in src/prompts/templates.py to change tone, length, structure, formatting rules, or output constraints for each platform. Each platform has its own dedicated prompt template that can be independently customized.</w:t>
+        <w:t xml:space="preserve">Mateo (@0xCastro) and Juan (@jmgomezl)</w:t>
       </w:r>
     </w:p>
     <w:sectPr>

</xml_diff>